<commit_message>
v445.4.0: Bauwirtschaft für KI-Workshops erweitern
</commit_message>
<xml_diff>
--- a/testakten/bauwirtschaft-vergabeverfahren-feuerwehrhaus-northeim/03_vergabeunterlagen.docx
+++ b/testakten/bauwirtschaft-vergabeverfahren-feuerwehrhaus-northeim/03_vergabeunterlagen.docx
@@ -113,12 +113,17 @@
         <w:pStyle w:val="Heading1"/>
       </w:pPr>
       <w:r>
-        <w:t>7 Ausführung und Abnahme</w:t>
+        <w:t>7 Vertragsgrundlagen, Ausführung und Abnahme</w:t>
       </w:r>
     </w:p>
     <w:p>
       <w:r>
-        <w:t>Die Ausführung beginnt am 02.11.2026 und muss am 30.04.2027 einschließlich Messung und Inbetriebnahme abgeschlossen sein. Innerhalb von zehn Arbeitstagen nach Zuschlag ist ein abgestimmter Montageablaufplan vorzulegen. Ausführungszeichnungen und Einbaumaße sind vor Bestellung der Geräte freizugeben. Eine Freigabe ersetzt nicht die Verantwortung für die angebotene Beschaffenheit. Die Abnahme wird nach Fertigstellungsanzeige gemeinsam durchgeführt und schriftlich protokolliert. Voraussetzungen sind die vollständige Funktion, die Übergabe der Bestandsunterlagen und die Einweisung. Mängelrechte richten sich nach den gesetzlichen Bestimmungen. Für dieses Vertragsverhältnis wird die VOB/B nicht zusätzlich einbezogen.</w:t>
+        <w:t>Vertragsbestandteile sind die VOB/B Ausgabe 2016 und die einschlägigen ATV der VOB/C Ausgabe 2019 einschließlich Ergänzungsband 2023. Für Widersprüche gilt die Rangfolge des Paragrafen 1 Absatz 2 VOB/B. Die nachfolgenden projektbezogenen Festlegungen ergänzen diese Vertragsbedingungen.</w:t>
+      </w:r>
+    </w:p>
+    <w:p>
+      <w:r>
+        <w:t>Die Ausführung beginnt am 02.11.2026 und muss am 30.04.2027 einschließlich Messung und Inbetriebnahme abgeschlossen sein. Innerhalb von zehn Arbeitstagen nach Zuschlag ist ein abgestimmter Montageablaufplan vorzulegen. Ausführungszeichnungen und Einbaumaße sind vor Bestellung der Geräte freizugeben. Eine Freigabe ersetzt nicht die Verantwortung für die angebotene Beschaffenheit. Die Stadt verlangt eine förmliche Abnahme nach Paragraf 12 Absatz 4 VOB/B. Dabei werden die Funktion, die Bestandsunterlagen und die Einweisung geprüft; unwesentliche Mängel berechtigen nicht zur Abnahmeverweigerung. Für Mängelansprüche gilt Paragraf 13 VOB/B.</w:t>
       </w:r>
     </w:p>
     <w:p>
@@ -131,7 +136,12 @@
     </w:p>
     <w:p>
       <w:r>
-        <w:t>Die Vergütung bestimmt sich nach den angebotenen Einheitspreisen und den gemeinsam festgestellten tatsächlichen Mengen. Ein unbedingter Nachlass gilt für alle Positionen. Änderungen des Leistungsumfangs bedürfen vor Ausführung einer dokumentierten Anordnung der Stadt und einer gesonderten Vergütungsabstimmung; zwingende gesetzliche Ansprüche bleiben unberührt. Abschlags- und Schlussrechnungen sind mit Positionsnachweis und Aufmaß elektronisch an die Vergabestelle zu richten. Prüffähige Rechnungen werden innerhalb von 30 Kalendertagen bezahlt. Vorauszahlungen, Sicherheiten und Vertragsstrafen werden nicht vereinbart. Die erste Wartung ist bereits im angebotenen Gesamtpreis enthalten und wird nach deren Durchführung abgerechnet.</w:t>
+        <w:t>Abrechnung und Vergütungsanpassungen richten sich nach Paragrafen 2 und 14 VOB/B. Ein unbedingter Nachlass gilt für alle Positionen. Änderungen und zusätzliche Leistungen richten sich nach Paragrafen 1 und 2 VOB/B; Anordnungen der Stadt und die Vergütungsabstimmung werden dokumentiert.</w:t>
+      </w:r>
+    </w:p>
+    <w:p>
+      <w:r>
+        <w:t>Abschlags- und Schlussrechnungen sind mit Positionsnachweis und Aufmaß elektronisch an die Vergabestelle zu richten. Monatliche Abschlagszahlungen werden binnen 21 Kalendertagen nach Zugang der prüfbaren Aufstellung fällig. Die Schlusszahlung wird nach Prüfung und Feststellung fällig, spätestens innerhalb von 30 Kalendertagen nach Zugang der Schlussrechnung; im Übrigen gilt Paragraf 16 VOB/B. Vorauszahlungen, Sicherheiten und Vertragsstrafen werden nicht vereinbart. Die erste Wartung ist bereits im angebotenen Gesamtpreis enthalten und wird nach deren Durchführung abgerechnet.</w:t>
       </w:r>
     </w:p>
     <w:p>
@@ -144,7 +154,7 @@
     </w:p>
     <w:p>
       <w:r>
-        <w:t>Der Auftragnehmer verpflichtet sich, die für seine Beschäftigten jeweils verbindlichen gesetzlichen und allgemeinverbindlichen tariflichen Mindestarbeitsbedingungen einzuhalten und diese Pflicht an eingesetzte Unterauftragnehmer weiterzugeben. Die angebotene Bauleitung muss während der Montage erreichbar sein. Ein Wechsel ist mit einer mindestens gleich erfahrenen Person rechtzeitig anzuzeigen. Der Auftragnehmer koordiniert seine Arbeiten mit den übrigen Gewerken, schützt benachbarte Bauteile und beseitigt eigene Abfälle. Für vom Auftraggeber bereitgestellte Anschlüsse und Flächen werden keine Umlagen erhoben. Bei Behinderungen ist die Bauleitung unverzüglich in Textform zu informieren.</w:t>
+        <w:t>Der Auftragnehmer verpflichtet sich, die für seine Beschäftigten jeweils verbindlichen gesetzlichen und allgemeinverbindlichen tariflichen Mindestarbeitsbedingungen einzuhalten und diese Pflicht an eingesetzte Unterauftragnehmer weiterzugeben. Die angebotene Bauleitung muss während der Montage erreichbar sein. Ein Wechsel ist mit einer mindestens gleich erfahrenen Person rechtzeitig anzuzeigen. Der Auftragnehmer koordiniert seine Arbeiten mit den übrigen Gewerken, schützt benachbarte Bauteile und beseitigt eigene Abfälle. Für vom Auftraggeber bereitgestellte Anschlüsse und Flächen werden keine Umlagen erhoben. Behinderungen sind der Stadt nach Paragraf 6 Absatz 1 VOB/B unverzüglich schriftlich anzuzeigen; die Bauleitung erhält eine Kopie.</w:t>
       </w:r>
     </w:p>
     <w:p>

</xml_diff>

<commit_message>
v445.4.0: Bauwirtschaft für KI-Workshops erweitern (#431)
</commit_message>
<xml_diff>
--- a/testakten/bauwirtschaft-vergabeverfahren-feuerwehrhaus-northeim/03_vergabeunterlagen.docx
+++ b/testakten/bauwirtschaft-vergabeverfahren-feuerwehrhaus-northeim/03_vergabeunterlagen.docx
@@ -113,12 +113,17 @@
         <w:pStyle w:val="Heading1"/>
       </w:pPr>
       <w:r>
-        <w:t>7 Ausführung und Abnahme</w:t>
+        <w:t>7 Vertragsgrundlagen, Ausführung und Abnahme</w:t>
       </w:r>
     </w:p>
     <w:p>
       <w:r>
-        <w:t>Die Ausführung beginnt am 02.11.2026 und muss am 30.04.2027 einschließlich Messung und Inbetriebnahme abgeschlossen sein. Innerhalb von zehn Arbeitstagen nach Zuschlag ist ein abgestimmter Montageablaufplan vorzulegen. Ausführungszeichnungen und Einbaumaße sind vor Bestellung der Geräte freizugeben. Eine Freigabe ersetzt nicht die Verantwortung für die angebotene Beschaffenheit. Die Abnahme wird nach Fertigstellungsanzeige gemeinsam durchgeführt und schriftlich protokolliert. Voraussetzungen sind die vollständige Funktion, die Übergabe der Bestandsunterlagen und die Einweisung. Mängelrechte richten sich nach den gesetzlichen Bestimmungen. Für dieses Vertragsverhältnis wird die VOB/B nicht zusätzlich einbezogen.</w:t>
+        <w:t>Vertragsbestandteile sind die VOB/B Ausgabe 2016 und die einschlägigen ATV der VOB/C Ausgabe 2019 einschließlich Ergänzungsband 2023. Für Widersprüche gilt die Rangfolge des Paragrafen 1 Absatz 2 VOB/B. Die nachfolgenden projektbezogenen Festlegungen ergänzen diese Vertragsbedingungen.</w:t>
+      </w:r>
+    </w:p>
+    <w:p>
+      <w:r>
+        <w:t>Die Ausführung beginnt am 02.11.2026 und muss am 30.04.2027 einschließlich Messung und Inbetriebnahme abgeschlossen sein. Innerhalb von zehn Arbeitstagen nach Zuschlag ist ein abgestimmter Montageablaufplan vorzulegen. Ausführungszeichnungen und Einbaumaße sind vor Bestellung der Geräte freizugeben. Eine Freigabe ersetzt nicht die Verantwortung für die angebotene Beschaffenheit. Die Stadt verlangt eine förmliche Abnahme nach Paragraf 12 Absatz 4 VOB/B. Dabei werden die Funktion, die Bestandsunterlagen und die Einweisung geprüft; unwesentliche Mängel berechtigen nicht zur Abnahmeverweigerung. Für Mängelansprüche gilt Paragraf 13 VOB/B.</w:t>
       </w:r>
     </w:p>
     <w:p>
@@ -131,7 +136,12 @@
     </w:p>
     <w:p>
       <w:r>
-        <w:t>Die Vergütung bestimmt sich nach den angebotenen Einheitspreisen und den gemeinsam festgestellten tatsächlichen Mengen. Ein unbedingter Nachlass gilt für alle Positionen. Änderungen des Leistungsumfangs bedürfen vor Ausführung einer dokumentierten Anordnung der Stadt und einer gesonderten Vergütungsabstimmung; zwingende gesetzliche Ansprüche bleiben unberührt. Abschlags- und Schlussrechnungen sind mit Positionsnachweis und Aufmaß elektronisch an die Vergabestelle zu richten. Prüffähige Rechnungen werden innerhalb von 30 Kalendertagen bezahlt. Vorauszahlungen, Sicherheiten und Vertragsstrafen werden nicht vereinbart. Die erste Wartung ist bereits im angebotenen Gesamtpreis enthalten und wird nach deren Durchführung abgerechnet.</w:t>
+        <w:t>Abrechnung und Vergütungsanpassungen richten sich nach Paragrafen 2 und 14 VOB/B. Ein unbedingter Nachlass gilt für alle Positionen. Änderungen und zusätzliche Leistungen richten sich nach Paragrafen 1 und 2 VOB/B; Anordnungen der Stadt und die Vergütungsabstimmung werden dokumentiert.</w:t>
+      </w:r>
+    </w:p>
+    <w:p>
+      <w:r>
+        <w:t>Abschlags- und Schlussrechnungen sind mit Positionsnachweis und Aufmaß elektronisch an die Vergabestelle zu richten. Monatliche Abschlagszahlungen werden binnen 21 Kalendertagen nach Zugang der prüfbaren Aufstellung fällig. Die Schlusszahlung wird nach Prüfung und Feststellung fällig, spätestens innerhalb von 30 Kalendertagen nach Zugang der Schlussrechnung; im Übrigen gilt Paragraf 16 VOB/B. Vorauszahlungen, Sicherheiten und Vertragsstrafen werden nicht vereinbart. Die erste Wartung ist bereits im angebotenen Gesamtpreis enthalten und wird nach deren Durchführung abgerechnet.</w:t>
       </w:r>
     </w:p>
     <w:p>
@@ -144,7 +154,7 @@
     </w:p>
     <w:p>
       <w:r>
-        <w:t>Der Auftragnehmer verpflichtet sich, die für seine Beschäftigten jeweils verbindlichen gesetzlichen und allgemeinverbindlichen tariflichen Mindestarbeitsbedingungen einzuhalten und diese Pflicht an eingesetzte Unterauftragnehmer weiterzugeben. Die angebotene Bauleitung muss während der Montage erreichbar sein. Ein Wechsel ist mit einer mindestens gleich erfahrenen Person rechtzeitig anzuzeigen. Der Auftragnehmer koordiniert seine Arbeiten mit den übrigen Gewerken, schützt benachbarte Bauteile und beseitigt eigene Abfälle. Für vom Auftraggeber bereitgestellte Anschlüsse und Flächen werden keine Umlagen erhoben. Bei Behinderungen ist die Bauleitung unverzüglich in Textform zu informieren.</w:t>
+        <w:t>Der Auftragnehmer verpflichtet sich, die für seine Beschäftigten jeweils verbindlichen gesetzlichen und allgemeinverbindlichen tariflichen Mindestarbeitsbedingungen einzuhalten und diese Pflicht an eingesetzte Unterauftragnehmer weiterzugeben. Die angebotene Bauleitung muss während der Montage erreichbar sein. Ein Wechsel ist mit einer mindestens gleich erfahrenen Person rechtzeitig anzuzeigen. Der Auftragnehmer koordiniert seine Arbeiten mit den übrigen Gewerken, schützt benachbarte Bauteile und beseitigt eigene Abfälle. Für vom Auftraggeber bereitgestellte Anschlüsse und Flächen werden keine Umlagen erhoben. Behinderungen sind der Stadt nach Paragraf 6 Absatz 1 VOB/B unverzüglich schriftlich anzuzeigen; die Bauleitung erhält eine Kopie.</w:t>
       </w:r>
     </w:p>
     <w:p>

</xml_diff>